<commit_message>
Add clickable links files (HTML, TXT, hyperlinked DOCX) for appendix sources
Co-Authored-By: Claude Opus 4.8 <noreply@anthropic.com>
Claude-Session: https://claude.ai/code/session_01AkgGYV3yP2PQ2xS2ETa6YJ
</commit_message>
<xml_diff>
--- a/עבודות_מחקר_משפטי/קישורים_ונספחים.docx
+++ b/עבודות_מחקר_משפטי/קישורים_ונספחים.docx
@@ -5,692 +5,669 @@
     <w:p>
       <w:pPr>
         <w:bidi w:val="1"/>
-        <w:spacing w:before="0" w:after="60" w:line="336" w:lineRule="auto"/>
+        <w:spacing w:before="0" w:after="80" w:line="312" w:lineRule="auto"/>
         <w:jc w:val="center"/>
       </w:pPr>
       <w:r>
         <w:rPr>
           <w:rFonts w:ascii="Times New Roman" w:hAnsi="Times New Roman" w:cs="Times New Roman"/>
           <w:b/>
-          <w:i w:val="0"/>
           <w:color w:val="000000"/>
-          <w:sz w:val="28"/>
+          <w:sz w:val="30"/>
           <w:bCs/>
           <w:rtl w:val="1"/>
         </w:rPr>
-        <w:t>קישורים לנספחים, לפי גרסה</w:t>
+        <w:t>קישורים לנספחים, עבודת מחקר משפטי</w:t>
       </w:r>
     </w:p>
     <w:p>
       <w:pPr>
         <w:bidi w:val="1"/>
-        <w:spacing w:before="0" w:after="160" w:line="336" w:lineRule="auto"/>
-        <w:jc w:val="both"/>
+        <w:spacing w:before="0" w:after="200" w:line="312" w:lineRule="auto"/>
+        <w:jc w:val="center"/>
       </w:pPr>
       <w:r>
         <w:rPr>
           <w:rFonts w:ascii="Times New Roman" w:hAnsi="Times New Roman" w:cs="Times New Roman"/>
           <w:b w:val="0"/>
-          <w:i w:val="0"/>
           <w:color w:val="000000"/>
           <w:sz w:val="21"/>
           <w:rtl w:val="1"/>
         </w:rPr>
-        <w:t>לפני הגשה: פתחו כל קישור בדפדפן ואמתו אותו. הקישורים אותרו דרך חיפוש (WebSearch) ולא נפתחו אוטומטית בסביבת העבודה. אם קישור הורדה של פסק דין אינו נפתח, חפשו את מספר ההליך ישירות באתר supremedecisions.court.gov.il או במאגר נבו.</w:t>
+        <w:t>לחצו על כל קישור כדי לפתוח את המקור ולהורידו. הבדיקה מותנית בצירוף הקבצים במלואם.</w:t>
       </w:r>
     </w:p>
     <w:p>
       <w:pPr>
         <w:bidi w:val="1"/>
-        <w:spacing w:before="160" w:after="60" w:line="336" w:lineRule="auto"/>
+        <w:spacing w:before="160" w:after="60" w:line="312" w:lineRule="auto"/>
         <w:jc w:val="right"/>
       </w:pPr>
       <w:r>
         <w:rPr>
           <w:rFonts w:ascii="Times New Roman" w:hAnsi="Times New Roman" w:cs="Times New Roman"/>
           <w:b/>
-          <w:i w:val="0"/>
           <w:color w:val="000000"/>
-          <w:sz w:val="24"/>
+          <w:sz w:val="25"/>
           <w:bCs/>
           <w:rtl w:val="1"/>
         </w:rPr>
-        <w:t>גרסה 1, לשון הרע ברשתות</w:t>
+        <w:t>גרסה 1 — לשון הרע ברשתות</w:t>
       </w:r>
     </w:p>
     <w:p>
       <w:pPr>
         <w:bidi w:val="1"/>
-        <w:spacing w:before="0" w:after="0" w:line="276" w:lineRule="auto"/>
+        <w:spacing w:before="0" w:after="0" w:line="312" w:lineRule="auto"/>
         <w:jc w:val="right"/>
       </w:pPr>
       <w:r>
         <w:rPr>
           <w:rFonts w:ascii="Times New Roman" w:hAnsi="Times New Roman" w:cs="Times New Roman"/>
           <w:b w:val="0"/>
-          <w:i w:val="0"/>
           <w:color w:val="000000"/>
           <w:sz w:val="21"/>
           <w:rtl w:val="1"/>
         </w:rPr>
-        <w:t>חוק איסור לשון הרע (נבו):</w:t>
+        <w:t>חוק איסור לשון הרע (נבו)</w:t>
       </w:r>
     </w:p>
     <w:p>
       <w:pPr>
-        <w:spacing w:after="80" w:line="276" w:lineRule="auto"/>
+        <w:spacing w:after="100" w:line="288" w:lineRule="auto"/>
         <w:jc w:val="left"/>
       </w:pPr>
-      <w:r>
-        <w:rPr>
-          <w:rFonts w:ascii="Times New Roman" w:hAnsi="Times New Roman" w:cs="Times New Roman"/>
-          <w:b w:val="0"/>
-          <w:i w:val="0"/>
-          <w:color w:val="000000"/>
-          <w:sz w:val="20"/>
-          <w:rtl w:val="1"/>
-        </w:rPr>
-        <w:t>https://www.nevo.co.il/law_html/law00/74372.htm</w:t>
-      </w:r>
+      <w:hyperlink r:id="rId9">
+        <w:r>
+          <w:rPr>
+            <w:rFonts w:ascii="Times New Roman" w:hAnsi="Times New Roman" w:cs="Times New Roman"/>
+            <w:color w:val="0645AD"/>
+            <w:u w:val="single"/>
+            <w:sz w:val="20"/>
+          </w:rPr>
+          <w:t>https://www.nevo.co.il/law_html/law00/74372.htm</w:t>
+        </w:r>
+      </w:hyperlink>
     </w:p>
     <w:p>
       <w:pPr>
         <w:bidi w:val="1"/>
-        <w:spacing w:before="0" w:after="0" w:line="276" w:lineRule="auto"/>
+        <w:spacing w:before="0" w:after="0" w:line="312" w:lineRule="auto"/>
         <w:jc w:val="right"/>
       </w:pPr>
       <w:r>
         <w:rPr>
           <w:rFonts w:ascii="Times New Roman" w:hAnsi="Times New Roman" w:cs="Times New Roman"/>
           <w:b w:val="0"/>
-          <w:i w:val="0"/>
           <w:color w:val="000000"/>
           <w:sz w:val="21"/>
           <w:rtl w:val="1"/>
         </w:rPr>
-        <w:t>חוק איסור לשון הרע (כנסת):</w:t>
+        <w:t>חוק איסור לשון הרע (כנסת)</w:t>
       </w:r>
     </w:p>
     <w:p>
       <w:pPr>
-        <w:spacing w:after="80" w:line="276" w:lineRule="auto"/>
+        <w:spacing w:after="100" w:line="288" w:lineRule="auto"/>
         <w:jc w:val="left"/>
       </w:pPr>
-      <w:r>
-        <w:rPr>
-          <w:rFonts w:ascii="Times New Roman" w:hAnsi="Times New Roman" w:cs="Times New Roman"/>
-          <w:b w:val="0"/>
-          <w:i w:val="0"/>
-          <w:color w:val="000000"/>
-          <w:sz w:val="20"/>
-          <w:rtl w:val="1"/>
-        </w:rPr>
-        <w:t>https://main.knesset.gov.il/Activity/Legislation/Laws/Pages/LawPrimary.aspx?lawitemid=2000089</w:t>
-      </w:r>
+      <w:hyperlink r:id="rId10">
+        <w:r>
+          <w:rPr>
+            <w:rFonts w:ascii="Times New Roman" w:hAnsi="Times New Roman" w:cs="Times New Roman"/>
+            <w:color w:val="0645AD"/>
+            <w:u w:val="single"/>
+            <w:sz w:val="20"/>
+          </w:rPr>
+          <w:t>https://main.knesset.gov.il/Activity/Legislation/Laws/Pages/LawPrimary.aspx?lawitemid=2000089</w:t>
+        </w:r>
+      </w:hyperlink>
     </w:p>
     <w:p>
       <w:pPr>
         <w:bidi w:val="1"/>
-        <w:spacing w:before="0" w:after="0" w:line="276" w:lineRule="auto"/>
+        <w:spacing w:before="0" w:after="0" w:line="312" w:lineRule="auto"/>
         <w:jc w:val="right"/>
       </w:pPr>
       <w:r>
         <w:rPr>
           <w:rFonts w:ascii="Times New Roman" w:hAnsi="Times New Roman" w:cs="Times New Roman"/>
           <w:b w:val="0"/>
-          <w:i w:val="0"/>
           <w:color w:val="000000"/>
           <w:sz w:val="21"/>
           <w:rtl w:val="1"/>
         </w:rPr>
-        <w:t>פסק הדין רע"א 1239/19, טקסט מלא (בית המשפט העליון):</w:t>
+        <w:t>פסק הדין רע"א 1239/19 שאול נ' נידיילי, טקסט מלא (בית המשפט העליון)</w:t>
       </w:r>
     </w:p>
     <w:p>
       <w:pPr>
-        <w:spacing w:after="80" w:line="276" w:lineRule="auto"/>
+        <w:spacing w:after="100" w:line="288" w:lineRule="auto"/>
         <w:jc w:val="left"/>
       </w:pPr>
-      <w:r>
-        <w:rPr>
-          <w:rFonts w:ascii="Times New Roman" w:hAnsi="Times New Roman" w:cs="Times New Roman"/>
-          <w:b w:val="0"/>
-          <w:i w:val="0"/>
-          <w:color w:val="000000"/>
-          <w:sz w:val="20"/>
-          <w:rtl w:val="1"/>
-        </w:rPr>
-        <w:t>https://supremedecisions.court.gov.il/Home/Download?path=HebrewVerdicts\19\390\012\a09&amp;fileName=19012390.A09&amp;type=2</w:t>
-      </w:r>
+      <w:hyperlink r:id="rId11">
+        <w:r>
+          <w:rPr>
+            <w:rFonts w:ascii="Times New Roman" w:hAnsi="Times New Roman" w:cs="Times New Roman"/>
+            <w:color w:val="0645AD"/>
+            <w:u w:val="single"/>
+            <w:sz w:val="20"/>
+          </w:rPr>
+          <w:t>https://supremedecisions.court.gov.il/Home/Download?path=HebrewVerdicts\19\390\012\a09&amp;fileName=19012390.A09&amp;type=2</w:t>
+        </w:r>
+      </w:hyperlink>
     </w:p>
     <w:p>
       <w:pPr>
         <w:bidi w:val="1"/>
-        <w:spacing w:before="0" w:after="0" w:line="276" w:lineRule="auto"/>
+        <w:spacing w:before="0" w:after="0" w:line="312" w:lineRule="auto"/>
         <w:jc w:val="right"/>
       </w:pPr>
       <w:r>
         <w:rPr>
           <w:rFonts w:ascii="Times New Roman" w:hAnsi="Times New Roman" w:cs="Times New Roman"/>
           <w:b w:val="0"/>
-          <w:i w:val="0"/>
           <w:color w:val="000000"/>
           <w:sz w:val="21"/>
           <w:rtl w:val="1"/>
         </w:rPr>
-        <w:t>מאמר מיכל לביא (כתב העת משפטים על אתר, PDF):</w:t>
+        <w:t>מאמר מיכל לביא (משפטים על אתר, PDF)</w:t>
       </w:r>
     </w:p>
     <w:p>
       <w:pPr>
-        <w:spacing w:after="80" w:line="276" w:lineRule="auto"/>
+        <w:spacing w:after="100" w:line="288" w:lineRule="auto"/>
         <w:jc w:val="left"/>
       </w:pPr>
-      <w:r>
-        <w:rPr>
-          <w:rFonts w:ascii="Times New Roman" w:hAnsi="Times New Roman" w:cs="Times New Roman"/>
-          <w:b w:val="0"/>
-          <w:i w:val="0"/>
-          <w:color w:val="000000"/>
-          <w:sz w:val="20"/>
-          <w:rtl w:val="1"/>
-        </w:rPr>
-        <w:t>https://lawjournal.huji.ac.il/sites/default/files/2021-03/mishpatimonline-15-159.pdf</w:t>
-      </w:r>
+      <w:hyperlink r:id="rId12">
+        <w:r>
+          <w:rPr>
+            <w:rFonts w:ascii="Times New Roman" w:hAnsi="Times New Roman" w:cs="Times New Roman"/>
+            <w:color w:val="0645AD"/>
+            <w:u w:val="single"/>
+            <w:sz w:val="20"/>
+          </w:rPr>
+          <w:t>https://lawjournal.huji.ac.il/sites/default/files/2021-03/mishpatimonline-15-159.pdf</w:t>
+        </w:r>
+      </w:hyperlink>
     </w:p>
     <w:p>
       <w:pPr>
         <w:bidi w:val="1"/>
-        <w:spacing w:before="160" w:after="60" w:line="336" w:lineRule="auto"/>
+        <w:spacing w:before="160" w:after="60" w:line="312" w:lineRule="auto"/>
         <w:jc w:val="right"/>
       </w:pPr>
       <w:r>
         <w:rPr>
           <w:rFonts w:ascii="Times New Roman" w:hAnsi="Times New Roman" w:cs="Times New Roman"/>
           <w:b/>
-          <w:i w:val="0"/>
           <w:color w:val="000000"/>
-          <w:sz w:val="24"/>
+          <w:sz w:val="25"/>
           <w:bCs/>
           <w:rtl w:val="1"/>
         </w:rPr>
-        <w:t>גרסה 2, פרטיות מול אינטרס ציבורי</w:t>
+        <w:t>גרסה 2 — פרטיות מול אינטרס ציבורי</w:t>
       </w:r>
     </w:p>
     <w:p>
       <w:pPr>
         <w:bidi w:val="1"/>
-        <w:spacing w:before="0" w:after="0" w:line="276" w:lineRule="auto"/>
+        <w:spacing w:before="0" w:after="0" w:line="312" w:lineRule="auto"/>
         <w:jc w:val="right"/>
       </w:pPr>
       <w:r>
         <w:rPr>
           <w:rFonts w:ascii="Times New Roman" w:hAnsi="Times New Roman" w:cs="Times New Roman"/>
           <w:b w:val="0"/>
-          <w:i w:val="0"/>
           <w:color w:val="000000"/>
           <w:sz w:val="21"/>
           <w:rtl w:val="1"/>
         </w:rPr>
-        <w:t>חוק הגנת הפרטיות (נבו):</w:t>
+        <w:t>חוק הגנת הפרטיות (נבו)</w:t>
       </w:r>
     </w:p>
     <w:p>
       <w:pPr>
-        <w:spacing w:after="80" w:line="276" w:lineRule="auto"/>
+        <w:spacing w:after="100" w:line="288" w:lineRule="auto"/>
         <w:jc w:val="left"/>
       </w:pPr>
-      <w:r>
-        <w:rPr>
-          <w:rFonts w:ascii="Times New Roman" w:hAnsi="Times New Roman" w:cs="Times New Roman"/>
-          <w:b w:val="0"/>
-          <w:i w:val="0"/>
-          <w:color w:val="000000"/>
-          <w:sz w:val="20"/>
-          <w:rtl w:val="1"/>
-        </w:rPr>
-        <w:t>https://www.nevo.co.il/law_html/law00/71631.htm</w:t>
-      </w:r>
+      <w:hyperlink r:id="rId13">
+        <w:r>
+          <w:rPr>
+            <w:rFonts w:ascii="Times New Roman" w:hAnsi="Times New Roman" w:cs="Times New Roman"/>
+            <w:color w:val="0645AD"/>
+            <w:u w:val="single"/>
+            <w:sz w:val="20"/>
+          </w:rPr>
+          <w:t>https://www.nevo.co.il/law_html/law00/71631.htm</w:t>
+        </w:r>
+      </w:hyperlink>
     </w:p>
     <w:p>
       <w:pPr>
         <w:bidi w:val="1"/>
-        <w:spacing w:before="0" w:after="0" w:line="276" w:lineRule="auto"/>
+        <w:spacing w:before="0" w:after="0" w:line="312" w:lineRule="auto"/>
         <w:jc w:val="right"/>
       </w:pPr>
       <w:r>
         <w:rPr>
           <w:rFonts w:ascii="Times New Roman" w:hAnsi="Times New Roman" w:cs="Times New Roman"/>
           <w:b w:val="0"/>
-          <w:i w:val="0"/>
           <w:color w:val="000000"/>
           <w:sz w:val="21"/>
           <w:rtl w:val="1"/>
         </w:rPr>
-        <w:t>חוק-יסוד: כבוד האדם וחירותו (כנסת):</w:t>
+        <w:t>חוק-יסוד: כבוד האדם וחירותו (כנסת)</w:t>
       </w:r>
     </w:p>
     <w:p>
       <w:pPr>
-        <w:spacing w:after="80" w:line="276" w:lineRule="auto"/>
+        <w:spacing w:after="100" w:line="288" w:lineRule="auto"/>
         <w:jc w:val="left"/>
       </w:pPr>
-      <w:r>
-        <w:rPr>
-          <w:rFonts w:ascii="Times New Roman" w:hAnsi="Times New Roman" w:cs="Times New Roman"/>
-          <w:b w:val="0"/>
-          <w:i w:val="0"/>
-          <w:color w:val="000000"/>
-          <w:sz w:val="20"/>
-          <w:rtl w:val="1"/>
-        </w:rPr>
-        <w:t>https://main.knesset.gov.il/Activity/Legislation/Laws/pages/lawbill.aspx?t=lawreshumot&amp;lawitemid=147337</w:t>
-      </w:r>
+      <w:hyperlink r:id="rId14">
+        <w:r>
+          <w:rPr>
+            <w:rFonts w:ascii="Times New Roman" w:hAnsi="Times New Roman" w:cs="Times New Roman"/>
+            <w:color w:val="0645AD"/>
+            <w:u w:val="single"/>
+            <w:sz w:val="20"/>
+          </w:rPr>
+          <w:t>https://main.knesset.gov.il/Activity/Legislation/Laws/pages/lawbill.aspx?t=lawreshumot&amp;lawitemid=147337</w:t>
+        </w:r>
+      </w:hyperlink>
     </w:p>
     <w:p>
       <w:pPr>
         <w:bidi w:val="1"/>
-        <w:spacing w:before="0" w:after="0" w:line="276" w:lineRule="auto"/>
+        <w:spacing w:before="0" w:after="0" w:line="312" w:lineRule="auto"/>
         <w:jc w:val="right"/>
       </w:pPr>
       <w:r>
         <w:rPr>
           <w:rFonts w:ascii="Times New Roman" w:hAnsi="Times New Roman" w:cs="Times New Roman"/>
           <w:b w:val="0"/>
-          <w:i w:val="0"/>
           <w:color w:val="000000"/>
           <w:sz w:val="21"/>
           <w:rtl w:val="1"/>
         </w:rPr>
-        <w:t>פסק הדין בג"ץ 3809/08, טקסט מלא (בית המשפט העליון):</w:t>
+        <w:t>פסק הדין בג"ץ 3809/08 האגודה לזכויות האזרח נ' משטרת ישראל, טקסט מלא (בית המשפט העליון)</w:t>
       </w:r>
     </w:p>
     <w:p>
       <w:pPr>
-        <w:spacing w:after="80" w:line="276" w:lineRule="auto"/>
+        <w:spacing w:after="100" w:line="288" w:lineRule="auto"/>
         <w:jc w:val="left"/>
       </w:pPr>
-      <w:r>
-        <w:rPr>
-          <w:rFonts w:ascii="Times New Roman" w:hAnsi="Times New Roman" w:cs="Times New Roman"/>
-          <w:b w:val="0"/>
-          <w:i w:val="0"/>
-          <w:color w:val="000000"/>
-          <w:sz w:val="20"/>
-          <w:rtl w:val="1"/>
-        </w:rPr>
-        <w:t>https://supremedecisions.court.gov.il/Home/Download?path=HebrewVerdicts\08\090\038\n15&amp;fileName=08038090_n15.txt&amp;type=2</w:t>
-      </w:r>
+      <w:hyperlink r:id="rId15">
+        <w:r>
+          <w:rPr>
+            <w:rFonts w:ascii="Times New Roman" w:hAnsi="Times New Roman" w:cs="Times New Roman"/>
+            <w:color w:val="0645AD"/>
+            <w:u w:val="single"/>
+            <w:sz w:val="20"/>
+          </w:rPr>
+          <w:t>https://supremedecisions.court.gov.il/Home/Download?path=HebrewVerdicts\08\090\038\n15&amp;fileName=08038090_n15.txt&amp;type=2</w:t>
+        </w:r>
+      </w:hyperlink>
     </w:p>
     <w:p>
       <w:pPr>
         <w:bidi w:val="1"/>
-        <w:spacing w:before="0" w:after="0" w:line="276" w:lineRule="auto"/>
+        <w:spacing w:before="0" w:after="0" w:line="312" w:lineRule="auto"/>
         <w:jc w:val="right"/>
       </w:pPr>
       <w:r>
         <w:rPr>
           <w:rFonts w:ascii="Times New Roman" w:hAnsi="Times New Roman" w:cs="Times New Roman"/>
           <w:b w:val="0"/>
-          <w:i w:val="0"/>
           <w:color w:val="000000"/>
           <w:sz w:val="21"/>
           <w:rtl w:val="1"/>
         </w:rPr>
-        <w:t>מאמר מיכאל בירנהק (PDF, פקולטה למשפטים חיפה):</w:t>
+        <w:t>מאמר מיכאל בירנהק (PDF, פקולטה למשפטים חיפה)</w:t>
       </w:r>
     </w:p>
     <w:p>
       <w:pPr>
-        <w:spacing w:after="80" w:line="276" w:lineRule="auto"/>
+        <w:spacing w:after="100" w:line="288" w:lineRule="auto"/>
         <w:jc w:val="left"/>
       </w:pPr>
-      <w:r>
-        <w:rPr>
-          <w:rFonts w:ascii="Times New Roman" w:hAnsi="Times New Roman" w:cs="Times New Roman"/>
-          <w:b w:val="0"/>
-          <w:i w:val="0"/>
-          <w:color w:val="000000"/>
-          <w:sz w:val="20"/>
-          <w:rtl w:val="1"/>
-        </w:rPr>
-        <w:t>https://law.haifa.ac.il/wp-content/uploads/2021/11/KD5.pdf</w:t>
-      </w:r>
+      <w:hyperlink r:id="rId16">
+        <w:r>
+          <w:rPr>
+            <w:rFonts w:ascii="Times New Roman" w:hAnsi="Times New Roman" w:cs="Times New Roman"/>
+            <w:color w:val="0645AD"/>
+            <w:u w:val="single"/>
+            <w:sz w:val="20"/>
+          </w:rPr>
+          <w:t>https://law.haifa.ac.il/wp-content/uploads/2021/11/KD5.pdf</w:t>
+        </w:r>
+      </w:hyperlink>
     </w:p>
     <w:p>
       <w:pPr>
         <w:bidi w:val="1"/>
-        <w:spacing w:before="160" w:after="60" w:line="336" w:lineRule="auto"/>
+        <w:spacing w:before="160" w:after="60" w:line="312" w:lineRule="auto"/>
         <w:jc w:val="right"/>
       </w:pPr>
       <w:r>
         <w:rPr>
           <w:rFonts w:ascii="Times New Roman" w:hAnsi="Times New Roman" w:cs="Times New Roman"/>
           <w:b/>
-          <w:i w:val="0"/>
           <w:color w:val="000000"/>
-          <w:sz w:val="24"/>
+          <w:sz w:val="25"/>
           <w:bCs/>
           <w:rtl w:val="1"/>
         </w:rPr>
-        <w:t>גרסה 3, חופש העיסוק ואי-תחרות</w:t>
+        <w:t>גרסה 3 — חופש העיסוק ואי-תחרות</w:t>
       </w:r>
     </w:p>
     <w:p>
       <w:pPr>
         <w:bidi w:val="1"/>
-        <w:spacing w:before="0" w:after="0" w:line="276" w:lineRule="auto"/>
+        <w:spacing w:before="0" w:after="0" w:line="312" w:lineRule="auto"/>
         <w:jc w:val="right"/>
       </w:pPr>
       <w:r>
         <w:rPr>
           <w:rFonts w:ascii="Times New Roman" w:hAnsi="Times New Roman" w:cs="Times New Roman"/>
           <w:b w:val="0"/>
-          <w:i w:val="0"/>
           <w:color w:val="000000"/>
           <w:sz w:val="21"/>
           <w:rtl w:val="1"/>
         </w:rPr>
-        <w:t>חוק-יסוד: חופש העיסוק (נבו):</w:t>
+        <w:t>חוק-יסוד: חופש העיסוק (נבו)</w:t>
       </w:r>
     </w:p>
     <w:p>
       <w:pPr>
-        <w:spacing w:after="80" w:line="276" w:lineRule="auto"/>
+        <w:spacing w:after="100" w:line="288" w:lineRule="auto"/>
         <w:jc w:val="left"/>
       </w:pPr>
-      <w:r>
-        <w:rPr>
-          <w:rFonts w:ascii="Times New Roman" w:hAnsi="Times New Roman" w:cs="Times New Roman"/>
-          <w:b w:val="0"/>
-          <w:i w:val="0"/>
-          <w:color w:val="000000"/>
-          <w:sz w:val="20"/>
-          <w:rtl w:val="1"/>
-        </w:rPr>
-        <w:t>https://www.nevo.co.il/law_html/law00/71905.htm</w:t>
-      </w:r>
+      <w:hyperlink r:id="rId17">
+        <w:r>
+          <w:rPr>
+            <w:rFonts w:ascii="Times New Roman" w:hAnsi="Times New Roman" w:cs="Times New Roman"/>
+            <w:color w:val="0645AD"/>
+            <w:u w:val="single"/>
+            <w:sz w:val="20"/>
+          </w:rPr>
+          <w:t>https://www.nevo.co.il/law_html/law00/71905.htm</w:t>
+        </w:r>
+      </w:hyperlink>
     </w:p>
     <w:p>
       <w:pPr>
         <w:bidi w:val="1"/>
-        <w:spacing w:before="0" w:after="0" w:line="276" w:lineRule="auto"/>
+        <w:spacing w:before="0" w:after="0" w:line="312" w:lineRule="auto"/>
         <w:jc w:val="right"/>
       </w:pPr>
       <w:r>
         <w:rPr>
           <w:rFonts w:ascii="Times New Roman" w:hAnsi="Times New Roman" w:cs="Times New Roman"/>
           <w:b w:val="0"/>
-          <w:i w:val="0"/>
           <w:color w:val="000000"/>
           <w:sz w:val="21"/>
           <w:rtl w:val="1"/>
         </w:rPr>
-        <w:t>חוק החוזים (חלק כללי) (נבו):</w:t>
+        <w:t>חוק החוזים (חלק כללי) (נבו)</w:t>
       </w:r>
     </w:p>
     <w:p>
       <w:pPr>
-        <w:spacing w:after="80" w:line="276" w:lineRule="auto"/>
+        <w:spacing w:after="100" w:line="288" w:lineRule="auto"/>
         <w:jc w:val="left"/>
       </w:pPr>
-      <w:r>
-        <w:rPr>
-          <w:rFonts w:ascii="Times New Roman" w:hAnsi="Times New Roman" w:cs="Times New Roman"/>
-          <w:b w:val="0"/>
-          <w:i w:val="0"/>
-          <w:color w:val="000000"/>
-          <w:sz w:val="20"/>
-          <w:rtl w:val="1"/>
-        </w:rPr>
-        <w:t>https://www.nevo.co.il/law_html/law00/71888.htm</w:t>
-      </w:r>
+      <w:hyperlink r:id="rId18">
+        <w:r>
+          <w:rPr>
+            <w:rFonts w:ascii="Times New Roman" w:hAnsi="Times New Roman" w:cs="Times New Roman"/>
+            <w:color w:val="0645AD"/>
+            <w:u w:val="single"/>
+            <w:sz w:val="20"/>
+          </w:rPr>
+          <w:t>https://www.nevo.co.il/law_html/law00/71888.htm</w:t>
+        </w:r>
+      </w:hyperlink>
     </w:p>
     <w:p>
       <w:pPr>
         <w:bidi w:val="1"/>
-        <w:spacing w:before="0" w:after="0" w:line="276" w:lineRule="auto"/>
+        <w:spacing w:before="0" w:after="0" w:line="312" w:lineRule="auto"/>
         <w:jc w:val="right"/>
       </w:pPr>
       <w:r>
         <w:rPr>
           <w:rFonts w:ascii="Times New Roman" w:hAnsi="Times New Roman" w:cs="Times New Roman"/>
           <w:b w:val="0"/>
-          <w:i w:val="0"/>
           <w:color w:val="000000"/>
           <w:sz w:val="21"/>
           <w:rtl w:val="1"/>
         </w:rPr>
-        <w:t>פסק הדין ע"א 6601/96 AES נ' סער (נבו):</w:t>
+        <w:t>פסק הדין ע"א 6601/96 AES נ' סער (נבו)</w:t>
       </w:r>
     </w:p>
     <w:p>
       <w:pPr>
-        <w:spacing w:after="80" w:line="276" w:lineRule="auto"/>
+        <w:spacing w:after="100" w:line="288" w:lineRule="auto"/>
         <w:jc w:val="left"/>
       </w:pPr>
-      <w:r>
-        <w:rPr>
-          <w:rFonts w:ascii="Times New Roman" w:hAnsi="Times New Roman" w:cs="Times New Roman"/>
-          <w:b w:val="0"/>
-          <w:i w:val="0"/>
-          <w:color w:val="000000"/>
-          <w:sz w:val="20"/>
-          <w:rtl w:val="1"/>
-        </w:rPr>
-        <w:t>https://www.nevo.co.il/psika_html/elyon/PADI-NG-3-850-L.htm</w:t>
-      </w:r>
+      <w:hyperlink r:id="rId19">
+        <w:r>
+          <w:rPr>
+            <w:rFonts w:ascii="Times New Roman" w:hAnsi="Times New Roman" w:cs="Times New Roman"/>
+            <w:color w:val="0645AD"/>
+            <w:u w:val="single"/>
+            <w:sz w:val="20"/>
+          </w:rPr>
+          <w:t>https://www.nevo.co.il/psika_html/elyon/PADI-NG-3-850-L.htm</w:t>
+        </w:r>
+      </w:hyperlink>
     </w:p>
     <w:p>
       <w:pPr>
         <w:bidi w:val="1"/>
-        <w:spacing w:before="0" w:after="0" w:line="276" w:lineRule="auto"/>
+        <w:spacing w:before="0" w:after="0" w:line="312" w:lineRule="auto"/>
         <w:jc w:val="right"/>
       </w:pPr>
       <w:r>
         <w:rPr>
           <w:rFonts w:ascii="Times New Roman" w:hAnsi="Times New Roman" w:cs="Times New Roman"/>
           <w:b w:val="0"/>
-          <w:i w:val="0"/>
           <w:color w:val="000000"/>
           <w:sz w:val="21"/>
           <w:rtl w:val="1"/>
         </w:rPr>
-        <w:t>חיפוש טקסט מלא לפי מספר הליך (בית המשפט העליון):</w:t>
+        <w:t>חיפוש טקסט מלא לפי מספר הליך (בית המשפט העליון)</w:t>
       </w:r>
     </w:p>
     <w:p>
       <w:pPr>
-        <w:spacing w:after="80" w:line="276" w:lineRule="auto"/>
+        <w:spacing w:after="100" w:line="288" w:lineRule="auto"/>
         <w:jc w:val="left"/>
       </w:pPr>
-      <w:r>
-        <w:rPr>
-          <w:rFonts w:ascii="Times New Roman" w:hAnsi="Times New Roman" w:cs="Times New Roman"/>
-          <w:b w:val="0"/>
-          <w:i w:val="0"/>
-          <w:color w:val="000000"/>
-          <w:sz w:val="20"/>
-          <w:rtl w:val="1"/>
-        </w:rPr>
-        <w:t>https://supremedecisions.court.gov.il/</w:t>
-      </w:r>
+      <w:hyperlink r:id="rId20">
+        <w:r>
+          <w:rPr>
+            <w:rFonts w:ascii="Times New Roman" w:hAnsi="Times New Roman" w:cs="Times New Roman"/>
+            <w:color w:val="0645AD"/>
+            <w:u w:val="single"/>
+            <w:sz w:val="20"/>
+          </w:rPr>
+          <w:t>https://supremedecisions.court.gov.il/</w:t>
+        </w:r>
+      </w:hyperlink>
     </w:p>
     <w:p>
       <w:pPr>
         <w:bidi w:val="1"/>
-        <w:spacing w:before="0" w:after="0" w:line="276" w:lineRule="auto"/>
+        <w:spacing w:before="0" w:after="0" w:line="312" w:lineRule="auto"/>
         <w:jc w:val="right"/>
       </w:pPr>
       <w:r>
         <w:rPr>
           <w:rFonts w:ascii="Times New Roman" w:hAnsi="Times New Roman" w:cs="Times New Roman"/>
           <w:b w:val="0"/>
-          <w:i w:val="0"/>
           <w:color w:val="000000"/>
           <w:sz w:val="21"/>
           <w:rtl w:val="1"/>
         </w:rPr>
-        <w:t>California Business and Professions Code § 16600:</w:t>
+        <w:t>California Business and Professions Code § 16600</w:t>
       </w:r>
     </w:p>
     <w:p>
       <w:pPr>
-        <w:spacing w:after="80" w:line="276" w:lineRule="auto"/>
+        <w:spacing w:after="100" w:line="288" w:lineRule="auto"/>
         <w:jc w:val="left"/>
       </w:pPr>
-      <w:r>
-        <w:rPr>
-          <w:rFonts w:ascii="Times New Roman" w:hAnsi="Times New Roman" w:cs="Times New Roman"/>
-          <w:b w:val="0"/>
-          <w:i w:val="0"/>
-          <w:color w:val="000000"/>
-          <w:sz w:val="20"/>
-          <w:rtl w:val="1"/>
-        </w:rPr>
-        <w:t>https://leginfo.legislature.ca.gov/faces/codes_displaySection.xhtml?sectionNum=16600&amp;lawCode=BPC</w:t>
-      </w:r>
+      <w:hyperlink r:id="rId21">
+        <w:r>
+          <w:rPr>
+            <w:rFonts w:ascii="Times New Roman" w:hAnsi="Times New Roman" w:cs="Times New Roman"/>
+            <w:color w:val="0645AD"/>
+            <w:u w:val="single"/>
+            <w:sz w:val="20"/>
+          </w:rPr>
+          <w:t>https://leginfo.legislature.ca.gov/faces/codes_displaySection.xhtml?sectionNum=16600&amp;lawCode=BPC</w:t>
+        </w:r>
+      </w:hyperlink>
     </w:p>
     <w:p>
       <w:pPr>
         <w:bidi w:val="1"/>
-        <w:spacing w:before="160" w:after="60" w:line="336" w:lineRule="auto"/>
+        <w:spacing w:before="160" w:after="60" w:line="312" w:lineRule="auto"/>
         <w:jc w:val="right"/>
       </w:pPr>
       <w:r>
         <w:rPr>
           <w:rFonts w:ascii="Times New Roman" w:hAnsi="Times New Roman" w:cs="Times New Roman"/>
           <w:b/>
-          <w:i w:val="0"/>
           <w:color w:val="000000"/>
-          <w:sz w:val="24"/>
+          <w:sz w:val="25"/>
           <w:bCs/>
           <w:rtl w:val="1"/>
         </w:rPr>
-        <w:t>גרסה 4, הגנת הצרכן במכר מרחוק</w:t>
+        <w:t>גרסה 4 — הגנת הצרכן במכר מרחוק</w:t>
       </w:r>
     </w:p>
     <w:p>
       <w:pPr>
         <w:bidi w:val="1"/>
-        <w:spacing w:before="0" w:after="0" w:line="276" w:lineRule="auto"/>
+        <w:spacing w:before="0" w:after="0" w:line="312" w:lineRule="auto"/>
         <w:jc w:val="right"/>
       </w:pPr>
       <w:r>
         <w:rPr>
           <w:rFonts w:ascii="Times New Roman" w:hAnsi="Times New Roman" w:cs="Times New Roman"/>
           <w:b w:val="0"/>
-          <w:i w:val="0"/>
           <w:color w:val="000000"/>
           <w:sz w:val="21"/>
           <w:rtl w:val="1"/>
         </w:rPr>
-        <w:t>חוק הגנת הצרכן (נבו):</w:t>
+        <w:t>חוק הגנת הצרכן (נבו)</w:t>
       </w:r>
     </w:p>
     <w:p>
       <w:pPr>
-        <w:spacing w:after="80" w:line="276" w:lineRule="auto"/>
+        <w:spacing w:after="100" w:line="288" w:lineRule="auto"/>
         <w:jc w:val="left"/>
       </w:pPr>
-      <w:r>
-        <w:rPr>
-          <w:rFonts w:ascii="Times New Roman" w:hAnsi="Times New Roman" w:cs="Times New Roman"/>
-          <w:b w:val="0"/>
-          <w:i w:val="0"/>
-          <w:color w:val="000000"/>
-          <w:sz w:val="20"/>
-          <w:rtl w:val="1"/>
-        </w:rPr>
-        <w:t>https://www.nevo.co.il/law_html/law00/70305.htm</w:t>
-      </w:r>
+      <w:hyperlink r:id="rId22">
+        <w:r>
+          <w:rPr>
+            <w:rFonts w:ascii="Times New Roman" w:hAnsi="Times New Roman" w:cs="Times New Roman"/>
+            <w:color w:val="0645AD"/>
+            <w:u w:val="single"/>
+            <w:sz w:val="20"/>
+          </w:rPr>
+          <w:t>https://www.nevo.co.il/law_html/law00/70305.htm</w:t>
+        </w:r>
+      </w:hyperlink>
     </w:p>
     <w:p>
       <w:pPr>
         <w:bidi w:val="1"/>
-        <w:spacing w:before="0" w:after="0" w:line="276" w:lineRule="auto"/>
+        <w:spacing w:before="0" w:after="0" w:line="312" w:lineRule="auto"/>
         <w:jc w:val="right"/>
       </w:pPr>
       <w:r>
         <w:rPr>
           <w:rFonts w:ascii="Times New Roman" w:hAnsi="Times New Roman" w:cs="Times New Roman"/>
           <w:b w:val="0"/>
-          <w:i w:val="0"/>
           <w:color w:val="000000"/>
           <w:sz w:val="21"/>
           <w:rtl w:val="1"/>
         </w:rPr>
-        <w:t>פסק הדין רע"א 3429/13 רז נ' גוליבר, טקסט מלא (בית המשפט העליון):</w:t>
+        <w:t>פסק הדין רע"א 3429/13 רז נ' גוליבר, טקסט מלא (בית המשפט העליון)</w:t>
       </w:r>
     </w:p>
     <w:p>
       <w:pPr>
-        <w:spacing w:after="80" w:line="276" w:lineRule="auto"/>
+        <w:spacing w:after="100" w:line="288" w:lineRule="auto"/>
         <w:jc w:val="left"/>
       </w:pPr>
-      <w:r>
-        <w:rPr>
-          <w:rFonts w:ascii="Times New Roman" w:hAnsi="Times New Roman" w:cs="Times New Roman"/>
-          <w:b w:val="0"/>
-          <w:i w:val="0"/>
-          <w:color w:val="000000"/>
-          <w:sz w:val="20"/>
-          <w:rtl w:val="1"/>
-        </w:rPr>
-        <w:t>https://supremedecisions.court.gov.il/Home/Download?path=HebrewVerdicts%2F13%2F290%2F034%2Fb02&amp;fileName=13034290_b02.txt&amp;type=2</w:t>
-      </w:r>
+      <w:hyperlink r:id="rId23">
+        <w:r>
+          <w:rPr>
+            <w:rFonts w:ascii="Times New Roman" w:hAnsi="Times New Roman" w:cs="Times New Roman"/>
+            <w:color w:val="0645AD"/>
+            <w:u w:val="single"/>
+            <w:sz w:val="20"/>
+          </w:rPr>
+          <w:t>https://supremedecisions.court.gov.il/Home/Download?path=HebrewVerdicts%2F13%2F290%2F034%2Fb02&amp;fileName=13034290_b02.txt&amp;type=2</w:t>
+        </w:r>
+      </w:hyperlink>
     </w:p>
     <w:p>
       <w:pPr>
         <w:bidi w:val="1"/>
-        <w:spacing w:before="0" w:after="0" w:line="276" w:lineRule="auto"/>
+        <w:spacing w:before="0" w:after="0" w:line="312" w:lineRule="auto"/>
         <w:jc w:val="right"/>
       </w:pPr>
       <w:r>
         <w:rPr>
           <w:rFonts w:ascii="Times New Roman" w:hAnsi="Times New Roman" w:cs="Times New Roman"/>
           <w:b w:val="0"/>
-          <w:i w:val="0"/>
           <w:color w:val="000000"/>
           <w:sz w:val="21"/>
           <w:rtl w:val="1"/>
         </w:rPr>
-        <w:t>Directive 2011/83/EU (EUR-Lex):</w:t>
+        <w:t>Directive 2011/83/EU (EUR-Lex)</w:t>
       </w:r>
     </w:p>
     <w:p>
       <w:pPr>
-        <w:spacing w:after="80" w:line="276" w:lineRule="auto"/>
+        <w:spacing w:after="100" w:line="288" w:lineRule="auto"/>
         <w:jc w:val="left"/>
+      </w:pPr>
+      <w:hyperlink r:id="rId24">
+        <w:r>
+          <w:rPr>
+            <w:rFonts w:ascii="Times New Roman" w:hAnsi="Times New Roman" w:cs="Times New Roman"/>
+            <w:color w:val="0645AD"/>
+            <w:u w:val="single"/>
+            <w:sz w:val="20"/>
+          </w:rPr>
+          <w:t>https://eur-lex.europa.eu/eli/dir/2011/83/oj</w:t>
+        </w:r>
+      </w:hyperlink>
+    </w:p>
+    <w:p>
+      <w:pPr>
+        <w:bidi w:val="1"/>
+        <w:spacing w:before="200" w:after="40" w:line="312" w:lineRule="auto"/>
+        <w:jc w:val="right"/>
       </w:pPr>
       <w:r>
         <w:rPr>
           <w:rFonts w:ascii="Times New Roman" w:hAnsi="Times New Roman" w:cs="Times New Roman"/>
           <w:b w:val="0"/>
-          <w:i w:val="0"/>
           <w:color w:val="000000"/>
           <w:sz w:val="20"/>
           <w:rtl w:val="1"/>
         </w:rPr>
-        <w:t>https://eur-lex.europa.eu/eli/dir/2011/83/oj</w:t>
-      </w:r>
-    </w:p>
-    <w:p>
-      <w:pPr>
-        <w:bidi w:val="1"/>
-        <w:spacing w:before="200" w:after="40" w:line="336" w:lineRule="auto"/>
-        <w:jc w:val="both"/>
-      </w:pPr>
-      <w:r>
-        <w:rPr>
-          <w:rFonts w:ascii="Times New Roman" w:hAnsi="Times New Roman" w:cs="Times New Roman"/>
-          <w:b w:val="0"/>
-          <w:i w:val="0"/>
-          <w:color w:val="000000"/>
-          <w:sz w:val="20"/>
-          <w:rtl w:val="1"/>
-        </w:rPr>
-        <w:t>נקודות לאימות ידני לפני הגשה: (א) מספרי העמוד ב'ספר החוקים' (ס"ח) לכל חוק; (ב) הכרך והשנה של מאמר בירנהק ושל מאמר לביא; (ג) פתיחת קובץ פסק הדין המלא וצירופו כנספח נפרד; (ד) המרת 'הערות השוליים' שבתחתית כל גרסה להערות שוליים אמיתיות בוורד (הוספה &lt; הערת שוליים).</w:t>
+        <w:t>אם קישור הורדה של פסק דין אינו נפתח, חפשו את מספר ההליך ישירות באתר בית המשפט העליון או בנבו. בנוסף אמתו לפני הגשה: מספרי עמוד ב"ספר החוקים", וכרך/שנה של המאמרים.</w:t>
       </w:r>
     </w:p>
     <w:sectPr>

</xml_diff>